<commit_message>
Rebrand to Wana Imba and add viewing workflow
</commit_message>
<xml_diff>
--- a/generated/agreements/property-management-agreement.docx
+++ b/generated/agreements/property-management-agreement.docx
@@ -8,7 +8,7 @@
         <w:jc w:val="center"/>
       </w:pPr>
       <w:r>
-        <w:t>ZimHomes Property Management Agreement</w:t>
+        <w:t>Wana Imba Property Management Agreement</w:t>
       </w:r>
     </w:p>
     <w:p/>
@@ -67,7 +67,7 @@
     <w:p/>
     <w:p>
       <w:r>
-        <w:t>Manager: ZimHomes [Private Limited / Trading Name]</w:t>
+        <w:t>Manager: Wana Imba [Private Limited / Trading Name]</w:t>
       </w:r>
     </w:p>
     <w:p>
@@ -77,23 +77,23 @@
     </w:p>
     <w:p>
       <w:r>
-        <w:t>Address: [ZimHomes Address]</w:t>
+        <w:t>Address: [Wana Imba Address]</w:t>
       </w:r>
     </w:p>
     <w:p>
       <w:r>
-        <w:t>Phone: [ZimHomes Phone]</w:t>
+        <w:t>Phone: [Wana Imba Phone]</w:t>
       </w:r>
     </w:p>
     <w:p>
       <w:r>
-        <w:t>Email: [ZimHomes Email]</w:t>
+        <w:t>Email: [Wana Imba Email]</w:t>
       </w:r>
     </w:p>
     <w:p/>
     <w:p>
       <w:r>
-        <w:t>The Owner appoints ZimHomes as property manager for the property described below.</w:t>
+        <w:t>The Owner appoints Wana Imba as property manager for the property described below.</w:t>
       </w:r>
     </w:p>
     <w:p/>
@@ -149,7 +149,7 @@
     <w:p/>
     <w:p>
       <w:r>
-        <w:t>The Owner confirms that the Owner has legal authority to appoint ZimHomes to manage the property.</w:t>
+        <w:t>The Owner confirms that the Owner has legal authority to appoint Wana Imba to manage the property.</w:t>
       </w:r>
     </w:p>
     <w:p/>
@@ -185,7 +185,7 @@
     <w:p/>
     <w:p>
       <w:r>
-        <w:t>ZimHomes may provide the following services:</w:t>
+        <w:t>Wana Imba may provide the following services:</w:t>
       </w:r>
     </w:p>
     <w:p/>
@@ -194,7 +194,7 @@
         <w:pStyle w:val="ListNumber"/>
       </w:pPr>
       <w:r>
-        <w:t>Advertise the property on ZimHomes and approved marketing channels.</w:t>
+        <w:t>Advertise the property on Wana Imba and approved marketing channels.</w:t>
       </w:r>
     </w:p>
     <w:p>
@@ -297,7 +297,7 @@
     <w:p/>
     <w:p>
       <w:r>
-        <w:t>The Owner will pay ZimHomes a management fee equal to [Percentage]% of rent collected each month.</w:t>
+        <w:t>The Owner will pay Wana Imba a management fee equal to [Percentage]% of rent collected each month.</w:t>
       </w:r>
     </w:p>
     <w:p/>
@@ -402,13 +402,13 @@
     <w:p/>
     <w:p>
       <w:r>
-        <w:t>ZimHomes will collect rent through approved payment methods, including Paynow-supported channels, bank transfer, mobile money, or other agreed methods.</w:t>
+        <w:t>Wana Imba will collect rent through approved payment methods, including Paynow-supported channels, bank transfer, mobile money, or other agreed methods.</w:t>
       </w:r>
     </w:p>
     <w:p/>
     <w:p>
       <w:r>
-        <w:t>ZimHomes will remit the Owner's net rental proceeds by [Day] of each month, after deducting approved fees, commissions, maintenance costs, and any agreed charges.</w:t>
+        <w:t>Wana Imba will remit the Owner's net rental proceeds by [Day] of each month, after deducting approved fees, commissions, maintenance costs, and any agreed charges.</w:t>
       </w:r>
     </w:p>
     <w:p/>
@@ -471,7 +471,7 @@
         <w:pStyle w:val="ListBullet"/>
       </w:pPr>
       <w:r>
-        <w:t>Deposit held by ZimHomes: [Yes / No]</w:t>
+        <w:t>Deposit held by Wana Imba: [Yes / No]</w:t>
       </w:r>
     </w:p>
     <w:p>
@@ -500,13 +500,13 @@
     <w:p/>
     <w:p>
       <w:r>
-        <w:t>ZimHomes may approve urgent repairs up to USD [Amount] without prior Owner approval where delay may cause damage, safety risk, security risk, or tenant hardship.</w:t>
+        <w:t>Wana Imba may approve urgent repairs up to USD [Amount] without prior Owner approval where delay may cause damage, safety risk, security risk, or tenant hardship.</w:t>
       </w:r>
     </w:p>
     <w:p/>
     <w:p>
       <w:r>
-        <w:t>For non-urgent repairs above USD [Amount], ZimHomes must obtain Owner approval before work begins.</w:t>
+        <w:t>For non-urgent repairs above USD [Amount], Wana Imba must obtain Owner approval before work begins.</w:t>
       </w:r>
     </w:p>
     <w:p/>
@@ -576,7 +576,7 @@
         <w:pStyle w:val="ListNumber"/>
       </w:pPr>
       <w:r>
-        <w:t>Not independently interfere with tenants placed or managed by ZimHomes without notifying ZimHomes.</w:t>
+        <w:t>Not independently interfere with tenants placed or managed by Wana Imba without notifying Wana Imba.</w:t>
       </w:r>
     </w:p>
     <w:p>
@@ -593,13 +593,13 @@
         <w:pStyle w:val="Heading1"/>
       </w:pPr>
       <w:r>
-        <w:t>11. ZimHomes Obligations</w:t>
+        <w:t>11. Wana Imba Obligations</w:t>
       </w:r>
     </w:p>
     <w:p/>
     <w:p>
       <w:r>
-        <w:t>ZimHomes agrees to:</w:t>
+        <w:t>Wana Imba agrees to:</w:t>
       </w:r>
     </w:p>
     <w:p/>
@@ -671,7 +671,7 @@
     <w:p/>
     <w:p>
       <w:r>
-        <w:t>The Owner may choose whether ZimHomes has authority to approve tenants:</w:t>
+        <w:t>The Owner may choose whether Wana Imba has authority to approve tenants:</w:t>
       </w:r>
     </w:p>
     <w:p/>
@@ -680,7 +680,7 @@
         <w:pStyle w:val="ListBullet"/>
       </w:pPr>
       <w:r>
-        <w:t>ZimHomes may approve tenants without further Owner consent: [Yes / No]</w:t>
+        <w:t>Wana Imba may approve tenants without further Owner consent: [Yes / No]</w:t>
       </w:r>
     </w:p>
     <w:p>
@@ -709,13 +709,13 @@
     <w:p/>
     <w:p>
       <w:r>
-        <w:t>The Owner authorises ZimHomes to use property photos, descriptions, location details, pricing, and availability information for advertising.</w:t>
+        <w:t>The Owner authorises Wana Imba to use property photos, descriptions, location details, pricing, and availability information for advertising.</w:t>
       </w:r>
     </w:p>
     <w:p/>
     <w:p>
       <w:r>
-        <w:t>ZimHomes may add a verified or managed-property badge after internal verification.</w:t>
+        <w:t>Wana Imba may add a verified or managed-property badge after internal verification.</w:t>
       </w:r>
     </w:p>
     <w:p/>
@@ -742,7 +742,7 @@
     <w:p/>
     <w:p>
       <w:r>
-        <w:t>ZimHomes is not liable for loss caused by tenant conduct, criminal activity, market vacancy, municipal service failure, force majeure, or property defects that were not caused by ZimHomes negligence or misconduct.</w:t>
+        <w:t>Wana Imba is not liable for loss caused by tenant conduct, criminal activity, market vacancy, municipal service failure, force majeure, or property defects that were not caused by Wana Imba negligence or misconduct.</w:t>
       </w:r>
     </w:p>
     <w:p/>
@@ -763,7 +763,7 @@
     <w:p/>
     <w:p>
       <w:r>
-        <w:t>ZimHomes may terminate immediately if:</w:t>
+        <w:t>Wana Imba may terminate immediately if:</w:t>
       </w:r>
     </w:p>
     <w:p/>
@@ -796,7 +796,7 @@
         <w:pStyle w:val="ListBullet"/>
       </w:pPr>
       <w:r>
-        <w:t>The Owner asks ZimHomes to act unlawfully.</w:t>
+        <w:t>The Owner asks Wana Imba to act unlawfully.</w:t>
       </w:r>
     </w:p>
     <w:p>
@@ -825,7 +825,7 @@
     <w:p/>
     <w:p>
       <w:r>
-        <w:t>If ZimHomes introduces a tenant, buyer, or occupant who later rents or buys the property directly from the Owner within [Number] months after introduction, the Owner must pay the agreed tenant placement fee, sales commission, or other agreed commission.</w:t>
+        <w:t>If Wana Imba introduces a tenant, buyer, or occupant who later rents or buys the property directly from the Owner within [Number] months after introduction, the Owner must pay the agreed tenant placement fee, sales commission, or other agreed commission.</w:t>
       </w:r>
     </w:p>
     <w:p/>
@@ -855,7 +855,7 @@
     <w:p/>
     <w:p>
       <w:r>
-        <w:t>Notices may be sent by hand delivery, email, WhatsApp, SMS, or through the ZimHomes platform, using the contact details in this Agreement.</w:t>
+        <w:t>Notices may be sent by hand delivery, email, WhatsApp, SMS, or through the Wana Imba platform, using the contact details in this Agreement.</w:t>
       </w:r>
     </w:p>
     <w:p/>
@@ -930,7 +930,7 @@
     <w:p/>
     <w:p>
       <w:r>
-        <w:t>Signed for ZimHomes:</w:t>
+        <w:t>Signed for Wana Imba:</w:t>
       </w:r>
     </w:p>
     <w:p/>
@@ -1095,7 +1095,6 @@
         <w:t>Owner payout details confirmed: [Yes / No]</w:t>
       </w:r>
     </w:p>
-    <w:p/>
     <w:sectPr>
       <w:pgSz w:w="12240" w:h="15840"/>
       <w:pgMar w:top="936" w:right="1008" w:bottom="936" w:left="1008" w:header="720" w:footer="720" w:gutter="0"/>

</xml_diff>